<commit_message>
Phase 3 wrap-up: bundled 404 page, drop missing italic font, Phase 3 report, corrected Phase 2 wording
Co-Authored-By: Claude Opus 5.5 <noreply@anthropic.com>
Claude-Session: https://claude.ai/code/session_01A99WRUuVqoo1XrC2Y9nW7m
</commit_message>
<xml_diff>
--- a/docs/Artemis_Phase2_Results.docx
+++ b/docs/Artemis_Phase2_Results.docx
@@ -113,7 +113,7 @@
         <w:spacing w:after="160" w:line="312"/>
       </w:pPr>
       <w:r>
-        <w:t xml:space="preserve">The lab found a way to rank earth-abundant, non-toxic crystals so that the expensive efficiency calculation reaches excellent solar absorbers much sooner than the usual rules of thumb. Its method puts near-stable materials first and then orders them by an efficiency predicted from cheap DFT properties and composition, using a forest of randomized decision trees trained on the 7,250 materials JARVIS has already assessed.</w:t>
+        <w:t xml:space="preserve">The lab found a way to rank earth-abundant crystals (with cadmium, mercury, lead, thallium, arsenic and radioactive elements excluded) so that the expensive efficiency calculation reaches excellent solar absorbers much sooner than the usual rules of thumb. Its method puts near-stable materials first and then orders them by an efficiency predicted from cheap DFT properties and composition, using a forest of randomized decision trees trained on the 7,250 materials JARVIS has already assessed.</w:t>
       </w:r>
     </w:p>
     <w:p>
@@ -121,7 +121,7 @@
         <w:spacing w:after="160" w:line="312"/>
       </w:pPr>
       <w:r>
-        <w:t xml:space="preserve">On the official held-out test, which the lab was allowed to run once, the method found all four excellent absorbers among 429 candidates after 8 expensive calculations. The best simple rule needed 20, and random search would need about 344. Because four hits is too few to trust on its own, I repeated the comparison afterwards on 20 larger search pools. The lab's method needed fewer calculations than the best simple rule in all 20, with a median of 14.5 calculations against 47.5 to find ten excellent absorbers, and against about 1,160 for random search.</w:t>
+        <w:t xml:space="preserve">On the official held-out test, which the lab was allowed to run once, the method found all four excellent absorbers among 429 candidates after 8 expensive calculations. The textbook rule (stable materials first, then band gap nearest 1.34 eV) needed 20, and random search would need about 344. Because four hits is too few to trust on its own, I repeated the comparison afterwards on 20 larger search pools, using a copy of the final method rebuilt from the lab's report. The rebuilt method needed fewer calculations than the textbook rule in all 20 pools and fewer than the corrected-gap rule in 19, with a median of 14.5 calculations to find ten excellent absorbers, against 26 for the corrected-gap rule, 47.5 for the textbook rule and about 1,161 for random search.</w:t>
       </w:r>
     </w:p>
     <w:p>
@@ -140,7 +140,7 @@
           <w:sz w:val="23"/>
           <w:szCs w:val="23"/>
         </w:rPr>
-        <w:t xml:space="preserve">The speed-up over the best simple rule is about three times, and it held in every one of twenty independent trials. The speed-up over random search is between about 40 and 90 times, depending on the size of the search pool.</w:t>
+        <w:t xml:space="preserve">On held-out data the method was about two and a half times faster than the textbook rule. In the later check over twenty overlapping pools it was about three times faster than the textbook rule in the median, and it was faster in every pool.</w:t>
       </w:r>
     </w:p>
     <w:p>
@@ -2007,7 +2007,7 @@
         <w:spacing w:after="160" w:line="312"/>
       </w:pPr>
       <w:r>
-        <w:t xml:space="preserve">Two cautions keep this honest. This check was designed and run after the official test, so it is supporting evidence rather than a pre-registered result. And the lab chose its method partly by looking at the practice set, whose materials are now spread through these pools, which could flatter the model slightly; the consistency across all twenty pools, and the Skeptic's earlier cross-validation on training data alone, make a large effect from this unlikely. Acceleration against random search also grows with the size of the pool, so the 43 on the small test pool and the 89 here are not in conflict; the comparison with the best simple rule is the stable number.</w:t>
+        <w:t xml:space="preserve">Two cautions keep this honest. This check was designed and run after the official test, so it is supporting evidence rather than a pre-registered result. And the lab chose its method partly by looking at the practice set, whose materials are now spread through these pools, which could flatter the model slightly; the consistency across all twenty pools, and the Skeptic's earlier cross-validation on training data alone, make a large effect from this unlikely. Acceleration against random search also grows with the size of the pool, so the 43 on the small test pool and the 89 here are not in conflict; the comparison with the textbook rule is the stable number.</w:t>
       </w:r>
     </w:p>
     <w:p>
@@ -5416,7 +5416,7 @@
         </w:rPr>
         <w:t xml:space="preserve">JARVIS-Leaderboard, Choudhary et al., npj Computational Materials 10, 93 (2024). </w:t>
       </w:r>
-      <w:hyperlink w:history="1" r:id="rIdpo55ocfv2vmiks0odtzor">
+      <w:hyperlink w:history="1" r:id="rIdfyphtmt9xxhcsrlrauxwq">
         <w:r>
           <w:rPr>
             <w:rStyle w:val="Hyperlink"/>
@@ -5439,7 +5439,7 @@
         </w:rPr>
         <w:t xml:space="preserve">JARVIS, Choudhary et al., npj Computational Materials 6, 173 (2020). </w:t>
       </w:r>
-      <w:hyperlink w:history="1" r:id="rIdl0hjoy2eaakq1rmdgi8jz">
+      <w:hyperlink w:history="1" r:id="rIdaserrnpnimn8domzibgv2">
         <w:r>
           <w:rPr>
             <w:rStyle w:val="Hyperlink"/>
@@ -5462,7 +5462,7 @@
         </w:rPr>
         <w:t xml:space="preserve">JARVIS-DFT 3D release 2021-08-18 (figshare). </w:t>
       </w:r>
-      <w:hyperlink w:history="1" r:id="rIdho8t9ytggot4ikoi1nnd6">
+      <w:hyperlink w:history="1" r:id="rIder5swmslwivjeqli4dfgz">
         <w:r>
           <w:rPr>
             <w:rStyle w:val="Hyperlink"/>
@@ -5485,7 +5485,7 @@
         </w:rPr>
         <w:t xml:space="preserve">SLME in JARVIS, Choudhary et al., Chem. Mater. 31, 5900 (2019). </w:t>
       </w:r>
-      <w:hyperlink w:history="1" r:id="rIdrx1v2lyazyeam_dd6adzs">
+      <w:hyperlink w:history="1" r:id="rIdjjps9ztheevbc2ugbiaqq">
         <w:r>
           <w:rPr>
             <w:rStyle w:val="Hyperlink"/>
@@ -5508,7 +5508,7 @@
         </w:rPr>
         <w:t xml:space="preserve">Crustal abundances, CRC Handbook 97th edition values. </w:t>
       </w:r>
-      <w:hyperlink w:history="1" r:id="rIdak9nbc8mpqcd-xtwsfkdd">
+      <w:hyperlink w:history="1" r:id="rIdyfzqzekaqt3oknob2ghn0">
         <w:r>
           <w:rPr>
             <w:rStyle w:val="Hyperlink"/>
@@ -5531,7 +5531,7 @@
         </w:rPr>
         <w:t xml:space="preserve">Pauling electronegativities used in the rebuilt model, pymatgen periodic table data. </w:t>
       </w:r>
-      <w:hyperlink w:history="1" r:id="rIdcmzwb-ntzg-mfz68ori8i">
+      <w:hyperlink w:history="1" r:id="rIdt88ntd2qipwhviljzlpzq">
         <w:r>
           <w:rPr>
             <w:rStyle w:val="Hyperlink"/>
@@ -5554,7 +5554,7 @@
         </w:rPr>
         <w:t xml:space="preserve">Wide-gap γ-CuCl, J. Cryst. Growth (2005). </w:t>
       </w:r>
-      <w:hyperlink w:history="1" r:id="rIdxqldut-nj88vtlomxk7oc">
+      <w:hyperlink w:history="1" r:id="rIdcno7xyix4wskokeykkitf">
         <w:r>
           <w:rPr>
             <w:rStyle w:val="Hyperlink"/>
@@ -5577,7 +5577,7 @@
         </w:rPr>
         <w:t xml:space="preserve">Lab report, transcript, rebuilt model and robustness data. </w:t>
       </w:r>
-      <w:hyperlink w:history="1" r:id="rIdydm5zd8fwngx8kpohpsxp">
+      <w:hyperlink w:history="1" r:id="rId6kjk-9affkaoj4k4gau7n">
         <w:r>
           <w:rPr>
             <w:rStyle w:val="Hyperlink"/>

</xml_diff>